<commit_message>
Update founder information and regenerate visa application documents
Corrected founder's personal details, educational background, and project count in `shared/founderData.ts`, `scripts/generate-ultimate-word-doc.ts`, and the regenerated `attached_assets/ULTIMATE_VISA_APPLICATION_PACKAGE.docx`.

Replit-Commit-Author: Agent
Replit-Commit-Session-Id: 5807e399-c637-464d-b624-dabf852f1e7a
Replit-Commit-Checkpoint-Type: full_checkpoint
Replit-Commit-Event-Id: 1c35080b-002c-4901-9b01-13b26f696f10
Replit-Commit-Screenshot-Url: https://storage.googleapis.com/screenshot-production-us-central1/bb967be1-e122-48b8-adfb-a1d29831aef1/5807e399-c637-464d-b624-dabf852f1e7a/kn1tGtu
</commit_message>
<xml_diff>
--- a/attached_assets/ULTIMATE_VISA_APPLICATION_PACKAGE.docx
+++ b/attached_assets/ULTIMATE_VISA_APPLICATION_PACKAGE.docx
@@ -102,7 +102,7 @@
           <w:sz w:val="24"/>
           <w:szCs w:val="24"/>
         </w:rPr>
-        <w:t xml:space="preserve">+44 7438 791754</w:t>
+        <w:t xml:space="preserve">+44 7493 363351</w:t>
       </w:r>
     </w:p>
     <w:p>
@@ -595,7 +595,7 @@
                 <w:sz w:val="22"/>
                 <w:szCs w:val="22"/>
               </w:rPr>
-              <w:t xml:space="preserve">April 17, 1995</w:t>
+              <w:t xml:space="preserve">October 15, 1989</w:t>
             </w:r>
           </w:p>
         </w:tc>
@@ -691,7 +691,7 @@
                 <w:sz w:val="22"/>
                 <w:szCs w:val="22"/>
               </w:rPr>
-              <w:t xml:space="preserve">+44 7438 791754</w:t>
+              <w:t xml:space="preserve">+44 7493 363351</w:t>
             </w:r>
           </w:p>
         </w:tc>
@@ -715,7 +715,7 @@
                 <w:sz w:val="22"/>
                 <w:szCs w:val="22"/>
               </w:rPr>
-              <w:t xml:space="preserve">B50350937</w:t>
+              <w:t xml:space="preserve">B00558762</w:t>
             </w:r>
           </w:p>
         </w:tc>
@@ -763,7 +763,7 @@
                 <w:sz w:val="22"/>
                 <w:szCs w:val="22"/>
               </w:rPr>
-              <w:t xml:space="preserve">MSc Data Science, Leeds Beckett University (2023)</w:t>
+              <w:t xml:space="preserve">MSc Data Science, Leeds Beckett University (2023); BSc IT &amp; Business Information Systems, Middlesex University (2017); Advanced Diploma Software Engineering, Aptech Computer Education</w:t>
             </w:r>
           </w:p>
         </w:tc>
@@ -787,7 +787,7 @@
                 <w:sz w:val="22"/>
                 <w:szCs w:val="22"/>
               </w:rPr>
-              <w:t xml:space="preserve">7+ years Full Stack Development, 50+ client projects</w:t>
+              <w:t xml:space="preserve">7+ years Full Stack Development, 15+ client projects</w:t>
             </w:r>
           </w:p>
         </w:tc>
@@ -856,7 +856,7 @@
           <w:sz w:val="24"/>
           <w:szCs w:val="24"/>
         </w:rPr>
-        <w:t xml:space="preserve">Experienced Full Stack Developer with 7+ years in software development, specialising in AI-powered applications, web development, and SaaS platforms. Proven track record of delivering 50+ successful client projects across Nigeria and the UK. Combines technical expertise with entrepreneurial vision to create innovative solutions that democratise access to complex services.</w:t>
+        <w:t xml:space="preserve">Experienced Full Stack Developer with 7+ years in software development, specialising in AI-powered applications, web development, and SaaS platforms. Proven track record of delivering 15+ successful client projects across Nigeria and the UK. Combines technical expertise with entrepreneurial vision to create innovative solutions that democratise access to complex services.</w:t>
       </w:r>
     </w:p>
     <w:p>
@@ -918,7 +918,24 @@
           <w:sz w:val="24"/>
           <w:szCs w:val="24"/>
         </w:rPr>
-        <w:t xml:space="preserve">BSc Computer Engineering - University of Benin, Nigeria</w:t>
+        <w:t xml:space="preserve">BSc IT &amp; Business Information Systems - Middlesex University (2017)</w:t>
+      </w:r>
+    </w:p>
+    <w:p>
+      <w:pPr>
+        <w:pStyle w:val="ListParagraph"/>
+        <w:numPr>
+          <w:ilvl w:val="0"/>
+          <w:numId w:val="1"/>
+        </w:numPr>
+        <w:spacing w:after="80"/>
+      </w:pPr>
+      <w:r>
+        <w:rPr>
+          <w:sz w:val="24"/>
+          <w:szCs w:val="24"/>
+        </w:rPr>
+        <w:t xml:space="preserve">Advanced Diploma Software Engineering - Aptech Computer Education</w:t>
       </w:r>
     </w:p>
     <w:p>
@@ -952,7 +969,7 @@
           <w:sz w:val="24"/>
           <w:szCs w:val="24"/>
         </w:rPr>
-        <w:t xml:space="preserve">50+ successful client projects delivered</w:t>
+        <w:t xml:space="preserve">15+ successful client projects delivered</w:t>
       </w:r>
     </w:p>
     <w:p>

</xml_diff>